<commit_message>
Add Volume 1 Days 109-115 line edit
</commit_message>
<xml_diff>
--- a/downloads/production/kdp/author-decision-sheet/lady-d-author-decision-sheet.docx
+++ b/downloads/production/kdp/author-decision-sheet/lady-d-author-decision-sheet.docx
@@ -270,7 +270,7 @@
               <w:spacing w:after="0"/>
             </w:pPr>
             <w:r>
-              <w:t>02fe20d</w:t>
+              <w:t>1d46ff6</w:t>
             </w:r>
           </w:p>
         </w:tc>
@@ -2677,7 +2677,7 @@
               <w:spacing w:after="0"/>
             </w:pPr>
             <w:r>
-              <w:t>784121</w:t>
+              <w:t>784287</w:t>
             </w:r>
           </w:p>
         </w:tc>
@@ -2697,7 +2697,7 @@
               <w:spacing w:after="0"/>
             </w:pPr>
             <w:r>
-              <w:t>f40a5eec096ddecb</w:t>
+              <w:t>52c4bc7e29a2b8f5</w:t>
             </w:r>
           </w:p>
         </w:tc>
@@ -3169,7 +3169,7 @@
               <w:spacing w:after="0"/>
             </w:pPr>
             <w:r>
-              <w:t>1588852</w:t>
+              <w:t>1589472</w:t>
             </w:r>
           </w:p>
         </w:tc>
@@ -3189,7 +3189,7 @@
               <w:spacing w:after="0"/>
             </w:pPr>
             <w:r>
-              <w:t>c421a0d42f4ad664</w:t>
+              <w:t>98174b36607928d8</w:t>
             </w:r>
           </w:p>
         </w:tc>

</xml_diff>

<commit_message>
Add Volume 1 Days 116-122 line edit
</commit_message>
<xml_diff>
--- a/downloads/production/kdp/author-decision-sheet/lady-d-author-decision-sheet.docx
+++ b/downloads/production/kdp/author-decision-sheet/lady-d-author-decision-sheet.docx
@@ -270,7 +270,7 @@
               <w:spacing w:after="0"/>
             </w:pPr>
             <w:r>
-              <w:t>1d46ff6</w:t>
+              <w:t>9ab860c</w:t>
             </w:r>
           </w:p>
         </w:tc>
@@ -2677,7 +2677,7 @@
               <w:spacing w:after="0"/>
             </w:pPr>
             <w:r>
-              <w:t>784287</w:t>
+              <w:t>784384</w:t>
             </w:r>
           </w:p>
         </w:tc>
@@ -2697,7 +2697,7 @@
               <w:spacing w:after="0"/>
             </w:pPr>
             <w:r>
-              <w:t>52c4bc7e29a2b8f5</w:t>
+              <w:t>f590187e78ada391</w:t>
             </w:r>
           </w:p>
         </w:tc>
@@ -3169,7 +3169,7 @@
               <w:spacing w:after="0"/>
             </w:pPr>
             <w:r>
-              <w:t>1589472</w:t>
+              <w:t>1589790</w:t>
             </w:r>
           </w:p>
         </w:tc>
@@ -3189,7 +3189,7 @@
               <w:spacing w:after="0"/>
             </w:pPr>
             <w:r>
-              <w:t>98174b36607928d8</w:t>
+              <w:t>cd69edfdcba7cc4a</w:t>
             </w:r>
           </w:p>
         </w:tc>

</xml_diff>

<commit_message>
Add Volume 1 Days 123-129 line edit
</commit_message>
<xml_diff>
--- a/downloads/production/kdp/author-decision-sheet/lady-d-author-decision-sheet.docx
+++ b/downloads/production/kdp/author-decision-sheet/lady-d-author-decision-sheet.docx
@@ -270,7 +270,7 @@
               <w:spacing w:after="0"/>
             </w:pPr>
             <w:r>
-              <w:t>9ab860c</w:t>
+              <w:t>d3a8466</w:t>
             </w:r>
           </w:p>
         </w:tc>
@@ -2677,7 +2677,7 @@
               <w:spacing w:after="0"/>
             </w:pPr>
             <w:r>
-              <w:t>784384</w:t>
+              <w:t>784480</w:t>
             </w:r>
           </w:p>
         </w:tc>
@@ -2697,7 +2697,7 @@
               <w:spacing w:after="0"/>
             </w:pPr>
             <w:r>
-              <w:t>f590187e78ada391</w:t>
+              <w:t>585646fc4dd31d0c</w:t>
             </w:r>
           </w:p>
         </w:tc>
@@ -3169,7 +3169,7 @@
               <w:spacing w:after="0"/>
             </w:pPr>
             <w:r>
-              <w:t>1589790</w:t>
+              <w:t>1590095</w:t>
             </w:r>
           </w:p>
         </w:tc>
@@ -3189,7 +3189,7 @@
               <w:spacing w:after="0"/>
             </w:pPr>
             <w:r>
-              <w:t>cd69edfdcba7cc4a</w:t>
+              <w:t>ff5c7be421b92fca</w:t>
             </w:r>
           </w:p>
         </w:tc>

</xml_diff>

<commit_message>
Add Volume 1 Days 130-136 line edit
</commit_message>
<xml_diff>
--- a/downloads/production/kdp/author-decision-sheet/lady-d-author-decision-sheet.docx
+++ b/downloads/production/kdp/author-decision-sheet/lady-d-author-decision-sheet.docx
@@ -270,7 +270,7 @@
               <w:spacing w:after="0"/>
             </w:pPr>
             <w:r>
-              <w:t>d3a8466</w:t>
+              <w:t>5b26ab4</w:t>
             </w:r>
           </w:p>
         </w:tc>
@@ -2677,7 +2677,7 @@
               <w:spacing w:after="0"/>
             </w:pPr>
             <w:r>
-              <w:t>784480</w:t>
+              <w:t>784600</w:t>
             </w:r>
           </w:p>
         </w:tc>
@@ -2697,7 +2697,7 @@
               <w:spacing w:after="0"/>
             </w:pPr>
             <w:r>
-              <w:t>585646fc4dd31d0c</w:t>
+              <w:t>6f7efb5cf3323a39</w:t>
             </w:r>
           </w:p>
         </w:tc>
@@ -3169,7 +3169,7 @@
               <w:spacing w:after="0"/>
             </w:pPr>
             <w:r>
-              <w:t>1590095</w:t>
+              <w:t>1590443</w:t>
             </w:r>
           </w:p>
         </w:tc>
@@ -3189,7 +3189,7 @@
               <w:spacing w:after="0"/>
             </w:pPr>
             <w:r>
-              <w:t>ff5c7be421b92fca</w:t>
+              <w:t>81d362c7b57d3967</w:t>
             </w:r>
           </w:p>
         </w:tc>

</xml_diff>

<commit_message>
Add Volume 1 Days 137-143 line edit
</commit_message>
<xml_diff>
--- a/downloads/production/kdp/author-decision-sheet/lady-d-author-decision-sheet.docx
+++ b/downloads/production/kdp/author-decision-sheet/lady-d-author-decision-sheet.docx
@@ -270,7 +270,7 @@
               <w:spacing w:after="0"/>
             </w:pPr>
             <w:r>
-              <w:t>5b26ab4</w:t>
+              <w:t>0cb5e77</w:t>
             </w:r>
           </w:p>
         </w:tc>
@@ -2677,7 +2677,7 @@
               <w:spacing w:after="0"/>
             </w:pPr>
             <w:r>
-              <w:t>784600</w:t>
+              <w:t>784732</w:t>
             </w:r>
           </w:p>
         </w:tc>
@@ -2697,7 +2697,7 @@
               <w:spacing w:after="0"/>
             </w:pPr>
             <w:r>
-              <w:t>6f7efb5cf3323a39</w:t>
+              <w:t>6f9ac05cb281ea75</w:t>
             </w:r>
           </w:p>
         </w:tc>
@@ -3169,7 +3169,7 @@
               <w:spacing w:after="0"/>
             </w:pPr>
             <w:r>
-              <w:t>1590443</w:t>
+              <w:t>1590815</w:t>
             </w:r>
           </w:p>
         </w:tc>
@@ -3189,7 +3189,7 @@
               <w:spacing w:after="0"/>
             </w:pPr>
             <w:r>
-              <w:t>81d362c7b57d3967</w:t>
+              <w:t>4eb9de08074d8d5a</w:t>
             </w:r>
           </w:p>
         </w:tc>

</xml_diff>

<commit_message>
Add Volume 1 Days 144-150 line edit
</commit_message>
<xml_diff>
--- a/downloads/production/kdp/author-decision-sheet/lady-d-author-decision-sheet.docx
+++ b/downloads/production/kdp/author-decision-sheet/lady-d-author-decision-sheet.docx
@@ -270,7 +270,7 @@
               <w:spacing w:after="0"/>
             </w:pPr>
             <w:r>
-              <w:t>0cb5e77</w:t>
+              <w:t>4b0cdbe</w:t>
             </w:r>
           </w:p>
         </w:tc>
@@ -2677,7 +2677,7 @@
               <w:spacing w:after="0"/>
             </w:pPr>
             <w:r>
-              <w:t>784732</w:t>
+              <w:t>784825</w:t>
             </w:r>
           </w:p>
         </w:tc>
@@ -2697,7 +2697,7 @@
               <w:spacing w:after="0"/>
             </w:pPr>
             <w:r>
-              <w:t>6f9ac05cb281ea75</w:t>
+              <w:t>a7fd9e41e36b38c6</w:t>
             </w:r>
           </w:p>
         </w:tc>
@@ -3169,7 +3169,7 @@
               <w:spacing w:after="0"/>
             </w:pPr>
             <w:r>
-              <w:t>1590815</w:t>
+              <w:t>1591138</w:t>
             </w:r>
           </w:p>
         </w:tc>
@@ -3189,7 +3189,7 @@
               <w:spacing w:after="0"/>
             </w:pPr>
             <w:r>
-              <w:t>4eb9de08074d8d5a</w:t>
+              <w:t>263242c4bc0acb17</w:t>
             </w:r>
           </w:p>
         </w:tc>

</xml_diff>

<commit_message>
Add Volume 1 Days 151-157 line edit
</commit_message>
<xml_diff>
--- a/downloads/production/kdp/author-decision-sheet/lady-d-author-decision-sheet.docx
+++ b/downloads/production/kdp/author-decision-sheet/lady-d-author-decision-sheet.docx
@@ -270,7 +270,7 @@
               <w:spacing w:after="0"/>
             </w:pPr>
             <w:r>
-              <w:t>4b0cdbe</w:t>
+              <w:t>22a8dfa</w:t>
             </w:r>
           </w:p>
         </w:tc>
@@ -2677,7 +2677,7 @@
               <w:spacing w:after="0"/>
             </w:pPr>
             <w:r>
-              <w:t>784825</w:t>
+              <w:t>784889</w:t>
             </w:r>
           </w:p>
         </w:tc>
@@ -2697,7 +2697,7 @@
               <w:spacing w:after="0"/>
             </w:pPr>
             <w:r>
-              <w:t>a7fd9e41e36b38c6</w:t>
+              <w:t>fff1032278da4816</w:t>
             </w:r>
           </w:p>
         </w:tc>
@@ -3169,7 +3169,7 @@
               <w:spacing w:after="0"/>
             </w:pPr>
             <w:r>
-              <w:t>1591138</w:t>
+              <w:t>1591312</w:t>
             </w:r>
           </w:p>
         </w:tc>
@@ -3189,7 +3189,7 @@
               <w:spacing w:after="0"/>
             </w:pPr>
             <w:r>
-              <w:t>263242c4bc0acb17</w:t>
+              <w:t>de7d815f45aa782b</w:t>
             </w:r>
           </w:p>
         </w:tc>

</xml_diff>

<commit_message>
Add Volume 1 Days 158-164 line edit
</commit_message>
<xml_diff>
--- a/downloads/production/kdp/author-decision-sheet/lady-d-author-decision-sheet.docx
+++ b/downloads/production/kdp/author-decision-sheet/lady-d-author-decision-sheet.docx
@@ -270,7 +270,7 @@
               <w:spacing w:after="0"/>
             </w:pPr>
             <w:r>
-              <w:t>22a8dfa</w:t>
+              <w:t>266943b</w:t>
             </w:r>
           </w:p>
         </w:tc>
@@ -2677,7 +2677,7 @@
               <w:spacing w:after="0"/>
             </w:pPr>
             <w:r>
-              <w:t>784889</w:t>
+              <w:t>785005</w:t>
             </w:r>
           </w:p>
         </w:tc>
@@ -2697,7 +2697,7 @@
               <w:spacing w:after="0"/>
             </w:pPr>
             <w:r>
-              <w:t>fff1032278da4816</w:t>
+              <w:t>71d5242249b39658</w:t>
             </w:r>
           </w:p>
         </w:tc>
@@ -3169,7 +3169,7 @@
               <w:spacing w:after="0"/>
             </w:pPr>
             <w:r>
-              <w:t>1591312</w:t>
+              <w:t>1591729</w:t>
             </w:r>
           </w:p>
         </w:tc>
@@ -3189,7 +3189,7 @@
               <w:spacing w:after="0"/>
             </w:pPr>
             <w:r>
-              <w:t>de7d815f45aa782b</w:t>
+              <w:t>bbb7a98aef5cd469</w:t>
             </w:r>
           </w:p>
         </w:tc>

</xml_diff>

<commit_message>
Add Volume 1 Days 165-171 line edit
</commit_message>
<xml_diff>
--- a/downloads/production/kdp/author-decision-sheet/lady-d-author-decision-sheet.docx
+++ b/downloads/production/kdp/author-decision-sheet/lady-d-author-decision-sheet.docx
@@ -270,7 +270,7 @@
               <w:spacing w:after="0"/>
             </w:pPr>
             <w:r>
-              <w:t>266943b</w:t>
+              <w:t>4f38f69</w:t>
             </w:r>
           </w:p>
         </w:tc>
@@ -2677,7 +2677,7 @@
               <w:spacing w:after="0"/>
             </w:pPr>
             <w:r>
-              <w:t>785005</w:t>
+              <w:t>785083</w:t>
             </w:r>
           </w:p>
         </w:tc>
@@ -2697,7 +2697,7 @@
               <w:spacing w:after="0"/>
             </w:pPr>
             <w:r>
-              <w:t>71d5242249b39658</w:t>
+              <w:t>34284bde37fa4ba0</w:t>
             </w:r>
           </w:p>
         </w:tc>
@@ -3169,7 +3169,7 @@
               <w:spacing w:after="0"/>
             </w:pPr>
             <w:r>
-              <w:t>1591729</w:t>
+              <w:t>1591989</w:t>
             </w:r>
           </w:p>
         </w:tc>
@@ -3189,7 +3189,7 @@
               <w:spacing w:after="0"/>
             </w:pPr>
             <w:r>
-              <w:t>bbb7a98aef5cd469</w:t>
+              <w:t>d67e600f9a4861dd</w:t>
             </w:r>
           </w:p>
         </w:tc>

</xml_diff>

<commit_message>
Add Volume 1 Days 172-178 line edit
</commit_message>
<xml_diff>
--- a/downloads/production/kdp/author-decision-sheet/lady-d-author-decision-sheet.docx
+++ b/downloads/production/kdp/author-decision-sheet/lady-d-author-decision-sheet.docx
@@ -270,7 +270,7 @@
               <w:spacing w:after="0"/>
             </w:pPr>
             <w:r>
-              <w:t>4f38f69</w:t>
+              <w:t>4840631</w:t>
             </w:r>
           </w:p>
         </w:tc>
@@ -2677,7 +2677,7 @@
               <w:spacing w:after="0"/>
             </w:pPr>
             <w:r>
-              <w:t>785083</w:t>
+              <w:t>785222</w:t>
             </w:r>
           </w:p>
         </w:tc>
@@ -2697,7 +2697,7 @@
               <w:spacing w:after="0"/>
             </w:pPr>
             <w:r>
-              <w:t>34284bde37fa4ba0</w:t>
+              <w:t>78e36c4e897d851e</w:t>
             </w:r>
           </w:p>
         </w:tc>
@@ -3169,7 +3169,7 @@
               <w:spacing w:after="0"/>
             </w:pPr>
             <w:r>
-              <w:t>1591989</w:t>
+              <w:t>1592342</w:t>
             </w:r>
           </w:p>
         </w:tc>
@@ -3189,7 +3189,7 @@
               <w:spacing w:after="0"/>
             </w:pPr>
             <w:r>
-              <w:t>d67e600f9a4861dd</w:t>
+              <w:t>2fb5fa48ae1b0ece</w:t>
             </w:r>
           </w:p>
         </w:tc>

</xml_diff>

<commit_message>
Add Volume 1 Days 179-181 line edit
</commit_message>
<xml_diff>
--- a/downloads/production/kdp/author-decision-sheet/lady-d-author-decision-sheet.docx
+++ b/downloads/production/kdp/author-decision-sheet/lady-d-author-decision-sheet.docx
@@ -270,7 +270,7 @@
               <w:spacing w:after="0"/>
             </w:pPr>
             <w:r>
-              <w:t>4840631</w:t>
+              <w:t>28132c2</w:t>
             </w:r>
           </w:p>
         </w:tc>
@@ -2677,7 +2677,7 @@
               <w:spacing w:after="0"/>
             </w:pPr>
             <w:r>
-              <w:t>785222</w:t>
+              <w:t>785252</w:t>
             </w:r>
           </w:p>
         </w:tc>
@@ -2697,7 +2697,7 @@
               <w:spacing w:after="0"/>
             </w:pPr>
             <w:r>
-              <w:t>78e36c4e897d851e</w:t>
+              <w:t>71a16b699339e57f</w:t>
             </w:r>
           </w:p>
         </w:tc>
@@ -3169,7 +3169,7 @@
               <w:spacing w:after="0"/>
             </w:pPr>
             <w:r>
-              <w:t>1592342</w:t>
+              <w:t>1592445</w:t>
             </w:r>
           </w:p>
         </w:tc>
@@ -3189,7 +3189,7 @@
               <w:spacing w:after="0"/>
             </w:pPr>
             <w:r>
-              <w:t>2fb5fa48ae1b0ece</w:t>
+              <w:t>cb39bf2ebcc77780</w:t>
             </w:r>
           </w:p>
         </w:tc>

</xml_diff>

<commit_message>
Add Volume 1 Days 182-188 line edit
</commit_message>
<xml_diff>
--- a/downloads/production/kdp/author-decision-sheet/lady-d-author-decision-sheet.docx
+++ b/downloads/production/kdp/author-decision-sheet/lady-d-author-decision-sheet.docx
@@ -270,7 +270,7 @@
               <w:spacing w:after="0"/>
             </w:pPr>
             <w:r>
-              <w:t>28132c2</w:t>
+              <w:t>20cc4bf</w:t>
             </w:r>
           </w:p>
         </w:tc>
@@ -2677,7 +2677,7 @@
               <w:spacing w:after="0"/>
             </w:pPr>
             <w:r>
-              <w:t>785252</w:t>
+              <w:t>785342</w:t>
             </w:r>
           </w:p>
         </w:tc>
@@ -2697,7 +2697,7 @@
               <w:spacing w:after="0"/>
             </w:pPr>
             <w:r>
-              <w:t>71a16b699339e57f</w:t>
+              <w:t>1a578885a2b9da23</w:t>
             </w:r>
           </w:p>
         </w:tc>
@@ -3169,7 +3169,7 @@
               <w:spacing w:after="0"/>
             </w:pPr>
             <w:r>
-              <w:t>1592445</w:t>
+              <w:t>1592742</w:t>
             </w:r>
           </w:p>
         </w:tc>
@@ -3189,7 +3189,7 @@
               <w:spacing w:after="0"/>
             </w:pPr>
             <w:r>
-              <w:t>cb39bf2ebcc77780</w:t>
+              <w:t>19e25c799a11e681</w:t>
             </w:r>
           </w:p>
         </w:tc>

</xml_diff>

<commit_message>
Add Volume 1 Days 189-195 line edit
</commit_message>
<xml_diff>
--- a/downloads/production/kdp/author-decision-sheet/lady-d-author-decision-sheet.docx
+++ b/downloads/production/kdp/author-decision-sheet/lady-d-author-decision-sheet.docx
@@ -270,7 +270,7 @@
               <w:spacing w:after="0"/>
             </w:pPr>
             <w:r>
-              <w:t>20cc4bf</w:t>
+              <w:t>9b18bee</w:t>
             </w:r>
           </w:p>
         </w:tc>
@@ -2677,7 +2677,7 @@
               <w:spacing w:after="0"/>
             </w:pPr>
             <w:r>
-              <w:t>785342</w:t>
+              <w:t>785379</w:t>
             </w:r>
           </w:p>
         </w:tc>
@@ -2697,7 +2697,7 @@
               <w:spacing w:after="0"/>
             </w:pPr>
             <w:r>
-              <w:t>1a578885a2b9da23</w:t>
+              <w:t>afe214ccad90c825</w:t>
             </w:r>
           </w:p>
         </w:tc>
@@ -3169,7 +3169,7 @@
               <w:spacing w:after="0"/>
             </w:pPr>
             <w:r>
-              <w:t>1592742</w:t>
+              <w:t>1592921</w:t>
             </w:r>
           </w:p>
         </w:tc>
@@ -3189,7 +3189,7 @@
               <w:spacing w:after="0"/>
             </w:pPr>
             <w:r>
-              <w:t>19e25c799a11e681</w:t>
+              <w:t>d2ddd57a64509f0c</w:t>
             </w:r>
           </w:p>
         </w:tc>

</xml_diff>

<commit_message>
Add Volume 1 Days 196-202 line edit
</commit_message>
<xml_diff>
--- a/downloads/production/kdp/author-decision-sheet/lady-d-author-decision-sheet.docx
+++ b/downloads/production/kdp/author-decision-sheet/lady-d-author-decision-sheet.docx
@@ -270,7 +270,7 @@
               <w:spacing w:after="0"/>
             </w:pPr>
             <w:r>
-              <w:t>9b18bee</w:t>
+              <w:t>65637f7</w:t>
             </w:r>
           </w:p>
         </w:tc>
@@ -2677,7 +2677,7 @@
               <w:spacing w:after="0"/>
             </w:pPr>
             <w:r>
-              <w:t>785379</w:t>
+              <w:t>785449</w:t>
             </w:r>
           </w:p>
         </w:tc>
@@ -2697,7 +2697,7 @@
               <w:spacing w:after="0"/>
             </w:pPr>
             <w:r>
-              <w:t>afe214ccad90c825</w:t>
+              <w:t>b487397659e7f0ea</w:t>
             </w:r>
           </w:p>
         </w:tc>
@@ -3169,7 +3169,7 @@
               <w:spacing w:after="0"/>
             </w:pPr>
             <w:r>
-              <w:t>1592921</w:t>
+              <w:t>1593139</w:t>
             </w:r>
           </w:p>
         </w:tc>
@@ -3189,7 +3189,7 @@
               <w:spacing w:after="0"/>
             </w:pPr>
             <w:r>
-              <w:t>d2ddd57a64509f0c</w:t>
+              <w:t>2f50c59b5bf22067</w:t>
             </w:r>
           </w:p>
         </w:tc>

</xml_diff>

<commit_message>
Add Volume 1 Days 203-209 line edit
</commit_message>
<xml_diff>
--- a/downloads/production/kdp/author-decision-sheet/lady-d-author-decision-sheet.docx
+++ b/downloads/production/kdp/author-decision-sheet/lady-d-author-decision-sheet.docx
@@ -270,7 +270,7 @@
               <w:spacing w:after="0"/>
             </w:pPr>
             <w:r>
-              <w:t>65637f7</w:t>
+              <w:t>6ce4793</w:t>
             </w:r>
           </w:p>
         </w:tc>
@@ -2677,7 +2677,7 @@
               <w:spacing w:after="0"/>
             </w:pPr>
             <w:r>
-              <w:t>785449</w:t>
+              <w:t>785459</w:t>
             </w:r>
           </w:p>
         </w:tc>
@@ -2697,7 +2697,7 @@
               <w:spacing w:after="0"/>
             </w:pPr>
             <w:r>
-              <w:t>b487397659e7f0ea</w:t>
+              <w:t>0527a019228869ac</w:t>
             </w:r>
           </w:p>
         </w:tc>
@@ -3169,7 +3169,7 @@
               <w:spacing w:after="0"/>
             </w:pPr>
             <w:r>
-              <w:t>1593139</w:t>
+              <w:t>1593238</w:t>
             </w:r>
           </w:p>
         </w:tc>
@@ -3189,7 +3189,7 @@
               <w:spacing w:after="0"/>
             </w:pPr>
             <w:r>
-              <w:t>2f50c59b5bf22067</w:t>
+              <w:t>a765b5e8f4e83b11</w:t>
             </w:r>
           </w:p>
         </w:tc>

</xml_diff>

<commit_message>
Add Volume 1 Days 210-216 line edit
</commit_message>
<xml_diff>
--- a/downloads/production/kdp/author-decision-sheet/lady-d-author-decision-sheet.docx
+++ b/downloads/production/kdp/author-decision-sheet/lady-d-author-decision-sheet.docx
@@ -270,7 +270,7 @@
               <w:spacing w:after="0"/>
             </w:pPr>
             <w:r>
-              <w:t>6ce4793</w:t>
+              <w:t>3378820</w:t>
             </w:r>
           </w:p>
         </w:tc>
@@ -2697,7 +2697,7 @@
               <w:spacing w:after="0"/>
             </w:pPr>
             <w:r>
-              <w:t>0527a019228869ac</w:t>
+              <w:t>7d1a641c5c5e4531</w:t>
             </w:r>
           </w:p>
         </w:tc>
@@ -3169,7 +3169,7 @@
               <w:spacing w:after="0"/>
             </w:pPr>
             <w:r>
-              <w:t>1593238</w:t>
+              <w:t>1593615</w:t>
             </w:r>
           </w:p>
         </w:tc>
@@ -3189,7 +3189,7 @@
               <w:spacing w:after="0"/>
             </w:pPr>
             <w:r>
-              <w:t>a765b5e8f4e83b11</w:t>
+              <w:t>00aa8617ab6fa9d0</w:t>
             </w:r>
           </w:p>
         </w:tc>

</xml_diff>

<commit_message>
Add Volume 1 Days 217-223 line edit
</commit_message>
<xml_diff>
--- a/downloads/production/kdp/author-decision-sheet/lady-d-author-decision-sheet.docx
+++ b/downloads/production/kdp/author-decision-sheet/lady-d-author-decision-sheet.docx
@@ -270,7 +270,7 @@
               <w:spacing w:after="0"/>
             </w:pPr>
             <w:r>
-              <w:t>3378820</w:t>
+              <w:t>4ef5fca</w:t>
             </w:r>
           </w:p>
         </w:tc>
@@ -2677,7 +2677,7 @@
               <w:spacing w:after="0"/>
             </w:pPr>
             <w:r>
-              <w:t>785459</w:t>
+              <w:t>785516</w:t>
             </w:r>
           </w:p>
         </w:tc>
@@ -2697,7 +2697,7 @@
               <w:spacing w:after="0"/>
             </w:pPr>
             <w:r>
-              <w:t>7d1a641c5c5e4531</w:t>
+              <w:t>5a8d241622235325</w:t>
             </w:r>
           </w:p>
         </w:tc>
@@ -3169,7 +3169,7 @@
               <w:spacing w:after="0"/>
             </w:pPr>
             <w:r>
-              <w:t>1593615</w:t>
+              <w:t>1593776</w:t>
             </w:r>
           </w:p>
         </w:tc>
@@ -3189,7 +3189,7 @@
               <w:spacing w:after="0"/>
             </w:pPr>
             <w:r>
-              <w:t>00aa8617ab6fa9d0</w:t>
+              <w:t>146a7ff6068aad04</w:t>
             </w:r>
           </w:p>
         </w:tc>

</xml_diff>

<commit_message>
Add Volume 1 Days 224-230 line edit
</commit_message>
<xml_diff>
--- a/downloads/production/kdp/author-decision-sheet/lady-d-author-decision-sheet.docx
+++ b/downloads/production/kdp/author-decision-sheet/lady-d-author-decision-sheet.docx
@@ -270,7 +270,7 @@
               <w:spacing w:after="0"/>
             </w:pPr>
             <w:r>
-              <w:t>4ef5fca</w:t>
+              <w:t>0bfdac3</w:t>
             </w:r>
           </w:p>
         </w:tc>
@@ -2677,7 +2677,7 @@
               <w:spacing w:after="0"/>
             </w:pPr>
             <w:r>
-              <w:t>785516</w:t>
+              <w:t>785500</w:t>
             </w:r>
           </w:p>
         </w:tc>
@@ -2697,7 +2697,7 @@
               <w:spacing w:after="0"/>
             </w:pPr>
             <w:r>
-              <w:t>5a8d241622235325</w:t>
+              <w:t>68c56ff4e338b890</w:t>
             </w:r>
           </w:p>
         </w:tc>
@@ -3169,7 +3169,7 @@
               <w:spacing w:after="0"/>
             </w:pPr>
             <w:r>
-              <w:t>1593776</w:t>
+              <w:t>1593827</w:t>
             </w:r>
           </w:p>
         </w:tc>
@@ -3189,7 +3189,7 @@
               <w:spacing w:after="0"/>
             </w:pPr>
             <w:r>
-              <w:t>146a7ff6068aad04</w:t>
+              <w:t>9d5cc24e52df076f</w:t>
             </w:r>
           </w:p>
         </w:tc>

</xml_diff>

<commit_message>
Add Volume 1 Days 231-237 line edit
</commit_message>
<xml_diff>
--- a/downloads/production/kdp/author-decision-sheet/lady-d-author-decision-sheet.docx
+++ b/downloads/production/kdp/author-decision-sheet/lady-d-author-decision-sheet.docx
@@ -270,7 +270,7 @@
               <w:spacing w:after="0"/>
             </w:pPr>
             <w:r>
-              <w:t>0bfdac3</w:t>
+              <w:t>13f99ab</w:t>
             </w:r>
           </w:p>
         </w:tc>
@@ -2697,7 +2697,7 @@
               <w:spacing w:after="0"/>
             </w:pPr>
             <w:r>
-              <w:t>68c56ff4e338b890</w:t>
+              <w:t>ecd3bf1f874a9cf3</w:t>
             </w:r>
           </w:p>
         </w:tc>
@@ -3169,7 +3169,7 @@
               <w:spacing w:after="0"/>
             </w:pPr>
             <w:r>
-              <w:t>1593827</w:t>
+              <w:t>1593856</w:t>
             </w:r>
           </w:p>
         </w:tc>
@@ -3189,7 +3189,7 @@
               <w:spacing w:after="0"/>
             </w:pPr>
             <w:r>
-              <w:t>9d5cc24e52df076f</w:t>
+              <w:t>10398202691e9a0b</w:t>
             </w:r>
           </w:p>
         </w:tc>

</xml_diff>

<commit_message>
Add Volume 1 Days 238-244 line edit
</commit_message>
<xml_diff>
--- a/downloads/production/kdp/author-decision-sheet/lady-d-author-decision-sheet.docx
+++ b/downloads/production/kdp/author-decision-sheet/lady-d-author-decision-sheet.docx
@@ -270,7 +270,7 @@
               <w:spacing w:after="0"/>
             </w:pPr>
             <w:r>
-              <w:t>13f99ab</w:t>
+              <w:t>0e8eb8d</w:t>
             </w:r>
           </w:p>
         </w:tc>
@@ -2677,7 +2677,7 @@
               <w:spacing w:after="0"/>
             </w:pPr>
             <w:r>
-              <w:t>785500</w:t>
+              <w:t>785504</w:t>
             </w:r>
           </w:p>
         </w:tc>
@@ -2697,7 +2697,7 @@
               <w:spacing w:after="0"/>
             </w:pPr>
             <w:r>
-              <w:t>ecd3bf1f874a9cf3</w:t>
+              <w:t>1f06a875b981b610</w:t>
             </w:r>
           </w:p>
         </w:tc>
@@ -3169,7 +3169,7 @@
               <w:spacing w:after="0"/>
             </w:pPr>
             <w:r>
-              <w:t>1593856</w:t>
+              <w:t>1593881</w:t>
             </w:r>
           </w:p>
         </w:tc>
@@ -3189,7 +3189,7 @@
               <w:spacing w:after="0"/>
             </w:pPr>
             <w:r>
-              <w:t>10398202691e9a0b</w:t>
+              <w:t>4b41ca231ed18c6d</w:t>
             </w:r>
           </w:p>
         </w:tc>

</xml_diff>

<commit_message>
Add Volume 1 Days 245-251 line edit
</commit_message>
<xml_diff>
--- a/downloads/production/kdp/author-decision-sheet/lady-d-author-decision-sheet.docx
+++ b/downloads/production/kdp/author-decision-sheet/lady-d-author-decision-sheet.docx
@@ -270,7 +270,7 @@
               <w:spacing w:after="0"/>
             </w:pPr>
             <w:r>
-              <w:t>0e8eb8d</w:t>
+              <w:t>7b3e6ed</w:t>
             </w:r>
           </w:p>
         </w:tc>
@@ -2677,7 +2677,7 @@
               <w:spacing w:after="0"/>
             </w:pPr>
             <w:r>
-              <w:t>785504</w:t>
+              <w:t>785499</w:t>
             </w:r>
           </w:p>
         </w:tc>
@@ -2697,7 +2697,7 @@
               <w:spacing w:after="0"/>
             </w:pPr>
             <w:r>
-              <w:t>1f06a875b981b610</w:t>
+              <w:t>fe2b4de42f872090</w:t>
             </w:r>
           </w:p>
         </w:tc>
@@ -3169,7 +3169,7 @@
               <w:spacing w:after="0"/>
             </w:pPr>
             <w:r>
-              <w:t>1593881</w:t>
+              <w:t>1593899</w:t>
             </w:r>
           </w:p>
         </w:tc>
@@ -3189,7 +3189,7 @@
               <w:spacing w:after="0"/>
             </w:pPr>
             <w:r>
-              <w:t>4b41ca231ed18c6d</w:t>
+              <w:t>281206fcd79af26f</w:t>
             </w:r>
           </w:p>
         </w:tc>

</xml_diff>

<commit_message>
Add Volume 1 Days 252-258 line edit
</commit_message>
<xml_diff>
--- a/downloads/production/kdp/author-decision-sheet/lady-d-author-decision-sheet.docx
+++ b/downloads/production/kdp/author-decision-sheet/lady-d-author-decision-sheet.docx
@@ -270,7 +270,7 @@
               <w:spacing w:after="0"/>
             </w:pPr>
             <w:r>
-              <w:t>7b3e6ed</w:t>
+              <w:t>5c4dd2c</w:t>
             </w:r>
           </w:p>
         </w:tc>
@@ -2677,7 +2677,7 @@
               <w:spacing w:after="0"/>
             </w:pPr>
             <w:r>
-              <w:t>785499</w:t>
+              <w:t>785535</w:t>
             </w:r>
           </w:p>
         </w:tc>
@@ -2697,7 +2697,7 @@
               <w:spacing w:after="0"/>
             </w:pPr>
             <w:r>
-              <w:t>fe2b4de42f872090</w:t>
+              <w:t>363bcf01060a0a55</w:t>
             </w:r>
           </w:p>
         </w:tc>
@@ -3169,7 +3169,7 @@
               <w:spacing w:after="0"/>
             </w:pPr>
             <w:r>
-              <w:t>1593899</w:t>
+              <w:t>1642206</w:t>
             </w:r>
           </w:p>
         </w:tc>
@@ -3189,7 +3189,7 @@
               <w:spacing w:after="0"/>
             </w:pPr>
             <w:r>
-              <w:t>281206fcd79af26f</w:t>
+              <w:t>5c2ac0ef23a6e49b</w:t>
             </w:r>
           </w:p>
         </w:tc>
@@ -3251,7 +3251,7 @@
               <w:spacing w:after="0"/>
             </w:pPr>
             <w:r>
-              <w:t>1374482</w:t>
+              <w:t>1405179</w:t>
             </w:r>
           </w:p>
         </w:tc>
@@ -3271,7 +3271,7 @@
               <w:spacing w:after="0"/>
             </w:pPr>
             <w:r>
-              <w:t>1eefb9f525600443</w:t>
+              <w:t>019a85ab3257a8b8</w:t>
             </w:r>
           </w:p>
         </w:tc>
@@ -3333,7 +3333,7 @@
               <w:spacing w:after="0"/>
             </w:pPr>
             <w:r>
-              <w:t>1348707</w:t>
+              <w:t>1628589</w:t>
             </w:r>
           </w:p>
         </w:tc>
@@ -3353,7 +3353,7 @@
               <w:spacing w:after="0"/>
             </w:pPr>
             <w:r>
-              <w:t>95018b3e8534e557</w:t>
+              <w:t>a1ae0bea9ebaf985</w:t>
             </w:r>
           </w:p>
         </w:tc>

</xml_diff>

<commit_message>
Reprocess Lady D enhanced plan and release surface
</commit_message>
<xml_diff>
--- a/downloads/production/kdp/author-decision-sheet/lady-d-author-decision-sheet.docx
+++ b/downloads/production/kdp/author-decision-sheet/lady-d-author-decision-sheet.docx
@@ -270,7 +270,7 @@
               <w:spacing w:after="0"/>
             </w:pPr>
             <w:r>
-              <w:t>5c4dd2c</w:t>
+              <w:t>55a6f74</w:t>
             </w:r>
           </w:p>
         </w:tc>
@@ -2677,7 +2677,7 @@
               <w:spacing w:after="0"/>
             </w:pPr>
             <w:r>
-              <w:t>785535</w:t>
+              <w:t>785562</w:t>
             </w:r>
           </w:p>
         </w:tc>
@@ -2697,7 +2697,7 @@
               <w:spacing w:after="0"/>
             </w:pPr>
             <w:r>
-              <w:t>363bcf01060a0a55</w:t>
+              <w:t>67738c55a02bc45d</w:t>
             </w:r>
           </w:p>
         </w:tc>
@@ -3169,7 +3169,7 @@
               <w:spacing w:after="0"/>
             </w:pPr>
             <w:r>
-              <w:t>1642206</w:t>
+              <w:t>1642158</w:t>
             </w:r>
           </w:p>
         </w:tc>
@@ -3189,7 +3189,7 @@
               <w:spacing w:after="0"/>
             </w:pPr>
             <w:r>
-              <w:t>5c2ac0ef23a6e49b</w:t>
+              <w:t>feb14859dc292a2a</w:t>
             </w:r>
           </w:p>
         </w:tc>

</xml_diff>